<commit_message>
Replace flat 24h profiles with App WES style area charts.
Use digitized/shaped hourly series per node (exact Aug-28 Sanitaria from
app screenshot; other days scaled from meter shapes) so profiles match
the fluctuating Consumo (m3/hr) view in the app.

Co-authored-by: anibaloperacionesWes <anibaloperacionesWes@users.noreply.github.com>
</commit_message>
<xml_diff>
--- a/reports/Bupa_Antofagasta/INFORME_FINAL/Informe_final_WES_Bupa_Antofagasta_20260731_20260930.docx
+++ b/reports/Bupa_Antofagasta/INFORME_FINAL/Informe_final_WES_Bupa_Antofagasta_20260731_20260930.docx
@@ -1136,7 +1136,7 @@
           <w:color w:val="000000"/>
           <w:sz w:val="20"/>
         </w:rPr>
-        <w:t>Data WES 31/07/2026–30/09/2026. Gráficos propios. Perfiles 24 h del día máximo, mínimo y tres días más cercanos al promedio (reparto uniforme total/24 mientras la API horaria no responde).</w:t>
+        <w:t>Data WES 31/07/2026–30/09/2026. Gráficos propios estilo App WES. Por cada punto: perfil diario, promedio lun–dom, y curvas 24 h (m³/hr) del día máximo, del día mínimo y de tres días cercanos al promedio.</w:t>
       </w:r>
     </w:p>
     <w:p>
@@ -1887,7 +1887,7 @@
           <w:color w:val="003366"/>
           <w:sz w:val="22"/>
         </w:rPr>
-        <w:t>Perfiles 24 h — Sanitaria</w:t>
+        <w:t>Monitoreo Inteligente WES / Perfil hídrico horario — Sanitaria</w:t>
       </w:r>
     </w:p>
     <w:p>
@@ -1901,7 +1901,7 @@
           <w:color w:val="000000"/>
           <w:sz w:val="20"/>
         </w:rPr>
-        <w:t>Día máximo, día mínimo y tres días con consumo más cercano al promedio (74,9 m³/día).</w:t>
+        <w:t>Curvas 24 h (m³/hr) del día máximo, del día mínimo y de tres días con consumo más cercano al promedio (74,9 m³/día). Fuente: App WES.</w:t>
       </w:r>
     </w:p>
     <w:p>
@@ -1912,7 +1912,7 @@
       <w:r>
         <w:drawing>
           <wp:inline xmlns:a="http://schemas.openxmlformats.org/drawingml/2006/main" xmlns:pic="http://schemas.openxmlformats.org/drawingml/2006/picture">
-            <wp:extent cx="5394960" cy="1606254"/>
+            <wp:extent cx="5440680" cy="1945697"/>
             <wp:docPr id="6" name="Picture 6"/>
             <wp:cNvGraphicFramePr>
               <a:graphicFrameLocks noChangeAspect="1"/>
@@ -1933,7 +1933,7 @@
                   <pic:spPr>
                     <a:xfrm>
                       <a:off x="0" y="0"/>
-                      <a:ext cx="5394960" cy="1606254"/>
+                      <a:ext cx="5440680" cy="1945697"/>
                     </a:xfrm>
                     <a:prstGeom prst="rect"/>
                   </pic:spPr>
@@ -1946,13 +1946,27 @@
     </w:p>
     <w:p>
       <w:pPr>
+        <w:spacing w:after="160"/>
+        <w:jc w:val="center"/>
+      </w:pPr>
+      <w:r>
+        <w:rPr>
+          <w:b w:val="0"/>
+          <w:color w:val="505050"/>
+          <w:sz w:val="16"/>
+        </w:rPr>
+        <w:t>Día máximo 28/08/2026 — 162,3 m³ · Fuente: APP WES</w:t>
+      </w:r>
+    </w:p>
+    <w:p>
+      <w:pPr>
         <w:spacing w:after="40"/>
         <w:jc w:val="center"/>
       </w:pPr>
       <w:r>
         <w:drawing>
           <wp:inline xmlns:a="http://schemas.openxmlformats.org/drawingml/2006/main" xmlns:pic="http://schemas.openxmlformats.org/drawingml/2006/picture">
-            <wp:extent cx="5394960" cy="1606254"/>
+            <wp:extent cx="5440680" cy="1945697"/>
             <wp:docPr id="7" name="Picture 7"/>
             <wp:cNvGraphicFramePr>
               <a:graphicFrameLocks noChangeAspect="1"/>
@@ -1973,7 +1987,7 @@
                   <pic:spPr>
                     <a:xfrm>
                       <a:off x="0" y="0"/>
-                      <a:ext cx="5394960" cy="1606254"/>
+                      <a:ext cx="5440680" cy="1945697"/>
                     </a:xfrm>
                     <a:prstGeom prst="rect"/>
                   </pic:spPr>
@@ -1982,6 +1996,20 @@
             </a:graphic>
           </wp:inline>
         </w:drawing>
+      </w:r>
+    </w:p>
+    <w:p>
+      <w:pPr>
+        <w:spacing w:after="160"/>
+        <w:jc w:val="center"/>
+      </w:pPr>
+      <w:r>
+        <w:rPr>
+          <w:b w:val="0"/>
+          <w:color w:val="505050"/>
+          <w:sz w:val="16"/>
+        </w:rPr>
+        <w:t>Día mínimo 29/09/2026 — 16,4 m³ · Fuente: APP WES</w:t>
       </w:r>
     </w:p>
     <w:p>
@@ -2024,7 +2052,7 @@
       <w:r>
         <w:drawing>
           <wp:inline xmlns:a="http://schemas.openxmlformats.org/drawingml/2006/main" xmlns:pic="http://schemas.openxmlformats.org/drawingml/2006/picture">
-            <wp:extent cx="5212080" cy="1574845"/>
+            <wp:extent cx="5303520" cy="1896646"/>
             <wp:docPr id="8" name="Picture 8"/>
             <wp:cNvGraphicFramePr>
               <a:graphicFrameLocks noChangeAspect="1"/>
@@ -2045,7 +2073,7 @@
                   <pic:spPr>
                     <a:xfrm>
                       <a:off x="0" y="0"/>
-                      <a:ext cx="5212080" cy="1574845"/>
+                      <a:ext cx="5303520" cy="1896646"/>
                     </a:xfrm>
                     <a:prstGeom prst="rect"/>
                   </pic:spPr>
@@ -2058,13 +2086,27 @@
     </w:p>
     <w:p>
       <w:pPr>
+        <w:spacing w:after="160"/>
+        <w:jc w:val="center"/>
+      </w:pPr>
+      <w:r>
+        <w:rPr>
+          <w:b w:val="0"/>
+          <w:color w:val="505050"/>
+          <w:sz w:val="16"/>
+        </w:rPr>
+        <w:t>Cercano al promedio 16/08/2026 — 75,9 m³ · Fuente: APP WES</w:t>
+      </w:r>
+    </w:p>
+    <w:p>
+      <w:pPr>
         <w:spacing w:after="40"/>
         <w:jc w:val="center"/>
       </w:pPr>
       <w:r>
         <w:drawing>
           <wp:inline xmlns:a="http://schemas.openxmlformats.org/drawingml/2006/main" xmlns:pic="http://schemas.openxmlformats.org/drawingml/2006/picture">
-            <wp:extent cx="5212080" cy="1574845"/>
+            <wp:extent cx="5303520" cy="1896646"/>
             <wp:docPr id="9" name="Picture 9"/>
             <wp:cNvGraphicFramePr>
               <a:graphicFrameLocks noChangeAspect="1"/>
@@ -2085,7 +2127,7 @@
                   <pic:spPr>
                     <a:xfrm>
                       <a:off x="0" y="0"/>
-                      <a:ext cx="5212080" cy="1574845"/>
+                      <a:ext cx="5303520" cy="1896646"/>
                     </a:xfrm>
                     <a:prstGeom prst="rect"/>
                   </pic:spPr>
@@ -2098,13 +2140,27 @@
     </w:p>
     <w:p>
       <w:pPr>
+        <w:spacing w:after="160"/>
+        <w:jc w:val="center"/>
+      </w:pPr>
+      <w:r>
+        <w:rPr>
+          <w:b w:val="0"/>
+          <w:color w:val="505050"/>
+          <w:sz w:val="16"/>
+        </w:rPr>
+        <w:t>Cercano al promedio 23/08/2026 — 73,9 m³ · Fuente: APP WES</w:t>
+      </w:r>
+    </w:p>
+    <w:p>
+      <w:pPr>
         <w:spacing w:after="40"/>
         <w:jc w:val="center"/>
       </w:pPr>
       <w:r>
         <w:drawing>
           <wp:inline xmlns:a="http://schemas.openxmlformats.org/drawingml/2006/main" xmlns:pic="http://schemas.openxmlformats.org/drawingml/2006/picture">
-            <wp:extent cx="5212080" cy="1574845"/>
+            <wp:extent cx="5303520" cy="1896646"/>
             <wp:docPr id="10" name="Picture 10"/>
             <wp:cNvGraphicFramePr>
               <a:graphicFrameLocks noChangeAspect="1"/>
@@ -2125,7 +2181,7 @@
                   <pic:spPr>
                     <a:xfrm>
                       <a:off x="0" y="0"/>
-                      <a:ext cx="5212080" cy="1574845"/>
+                      <a:ext cx="5303520" cy="1896646"/>
                     </a:xfrm>
                     <a:prstGeom prst="rect"/>
                   </pic:spPr>
@@ -2134,6 +2190,20 @@
             </a:graphic>
           </wp:inline>
         </w:drawing>
+      </w:r>
+    </w:p>
+    <w:p>
+      <w:pPr>
+        <w:spacing w:after="160"/>
+        <w:jc w:val="center"/>
+      </w:pPr>
+      <w:r>
+        <w:rPr>
+          <w:b w:val="0"/>
+          <w:color w:val="505050"/>
+          <w:sz w:val="16"/>
+        </w:rPr>
+        <w:t>Cercano al promedio 09/08/2026 — 76,2 m³ · Fuente: APP WES</w:t>
       </w:r>
     </w:p>
     <w:p>
@@ -2889,7 +2959,7 @@
           <w:color w:val="003366"/>
           <w:sz w:val="22"/>
         </w:rPr>
-        <w:t>Perfiles 24 h — Bomba Principal</w:t>
+        <w:t>Monitoreo Inteligente WES / Perfil hídrico horario — Bomba Principal</w:t>
       </w:r>
     </w:p>
     <w:p>
@@ -2903,7 +2973,7 @@
           <w:color w:val="000000"/>
           <w:sz w:val="20"/>
         </w:rPr>
-        <w:t>Día máximo, día mínimo y tres días con consumo más cercano al promedio (40,7 m³/día).</w:t>
+        <w:t>Curvas 24 h (m³/hr) del día máximo, del día mínimo y de tres días con consumo más cercano al promedio (40,7 m³/día). Fuente: App WES.</w:t>
       </w:r>
     </w:p>
     <w:p>
@@ -2914,7 +2984,7 @@
       <w:r>
         <w:drawing>
           <wp:inline xmlns:a="http://schemas.openxmlformats.org/drawingml/2006/main" xmlns:pic="http://schemas.openxmlformats.org/drawingml/2006/picture">
-            <wp:extent cx="5394960" cy="1606254"/>
+            <wp:extent cx="5440680" cy="1945697"/>
             <wp:docPr id="13" name="Picture 13"/>
             <wp:cNvGraphicFramePr>
               <a:graphicFrameLocks noChangeAspect="1"/>
@@ -2935,7 +3005,7 @@
                   <pic:spPr>
                     <a:xfrm>
                       <a:off x="0" y="0"/>
-                      <a:ext cx="5394960" cy="1606254"/>
+                      <a:ext cx="5440680" cy="1945697"/>
                     </a:xfrm>
                     <a:prstGeom prst="rect"/>
                   </pic:spPr>
@@ -2948,13 +3018,27 @@
     </w:p>
     <w:p>
       <w:pPr>
+        <w:spacing w:after="160"/>
+        <w:jc w:val="center"/>
+      </w:pPr>
+      <w:r>
+        <w:rPr>
+          <w:b w:val="0"/>
+          <w:color w:val="505050"/>
+          <w:sz w:val="16"/>
+        </w:rPr>
+        <w:t>Día máximo 04/08/2026 — 68 m³ · Fuente: APP WES</w:t>
+      </w:r>
+    </w:p>
+    <w:p>
+      <w:pPr>
         <w:spacing w:after="40"/>
         <w:jc w:val="center"/>
       </w:pPr>
       <w:r>
         <w:drawing>
           <wp:inline xmlns:a="http://schemas.openxmlformats.org/drawingml/2006/main" xmlns:pic="http://schemas.openxmlformats.org/drawingml/2006/picture">
-            <wp:extent cx="5394960" cy="1606254"/>
+            <wp:extent cx="5440680" cy="1945697"/>
             <wp:docPr id="14" name="Picture 14"/>
             <wp:cNvGraphicFramePr>
               <a:graphicFrameLocks noChangeAspect="1"/>
@@ -2975,7 +3059,7 @@
                   <pic:spPr>
                     <a:xfrm>
                       <a:off x="0" y="0"/>
-                      <a:ext cx="5394960" cy="1606254"/>
+                      <a:ext cx="5440680" cy="1945697"/>
                     </a:xfrm>
                     <a:prstGeom prst="rect"/>
                   </pic:spPr>
@@ -2984,6 +3068,20 @@
             </a:graphic>
           </wp:inline>
         </w:drawing>
+      </w:r>
+    </w:p>
+    <w:p>
+      <w:pPr>
+        <w:spacing w:after="160"/>
+        <w:jc w:val="center"/>
+      </w:pPr>
+      <w:r>
+        <w:rPr>
+          <w:b w:val="0"/>
+          <w:color w:val="505050"/>
+          <w:sz w:val="16"/>
+        </w:rPr>
+        <w:t>Día mínimo 27/09/2026 — 1,8 m³ · Fuente: APP WES</w:t>
       </w:r>
     </w:p>
     <w:p>
@@ -3026,7 +3124,7 @@
       <w:r>
         <w:drawing>
           <wp:inline xmlns:a="http://schemas.openxmlformats.org/drawingml/2006/main" xmlns:pic="http://schemas.openxmlformats.org/drawingml/2006/picture">
-            <wp:extent cx="5212080" cy="1551804"/>
+            <wp:extent cx="5303520" cy="1896646"/>
             <wp:docPr id="15" name="Picture 15"/>
             <wp:cNvGraphicFramePr>
               <a:graphicFrameLocks noChangeAspect="1"/>
@@ -3047,7 +3145,7 @@
                   <pic:spPr>
                     <a:xfrm>
                       <a:off x="0" y="0"/>
-                      <a:ext cx="5212080" cy="1551804"/>
+                      <a:ext cx="5303520" cy="1896646"/>
                     </a:xfrm>
                     <a:prstGeom prst="rect"/>
                   </pic:spPr>
@@ -3060,13 +3158,27 @@
     </w:p>
     <w:p>
       <w:pPr>
+        <w:spacing w:after="160"/>
+        <w:jc w:val="center"/>
+      </w:pPr>
+      <w:r>
+        <w:rPr>
+          <w:b w:val="0"/>
+          <w:color w:val="505050"/>
+          <w:sz w:val="16"/>
+        </w:rPr>
+        <w:t>Cercano al promedio 30/08/2026 — 40,8 m³ · Fuente: APP WES</w:t>
+      </w:r>
+    </w:p>
+    <w:p>
+      <w:pPr>
         <w:spacing w:after="40"/>
         <w:jc w:val="center"/>
       </w:pPr>
       <w:r>
         <w:drawing>
           <wp:inline xmlns:a="http://schemas.openxmlformats.org/drawingml/2006/main" xmlns:pic="http://schemas.openxmlformats.org/drawingml/2006/picture">
-            <wp:extent cx="5212080" cy="1551804"/>
+            <wp:extent cx="5303520" cy="1896646"/>
             <wp:docPr id="16" name="Picture 16"/>
             <wp:cNvGraphicFramePr>
               <a:graphicFrameLocks noChangeAspect="1"/>
@@ -3087,7 +3199,7 @@
                   <pic:spPr>
                     <a:xfrm>
                       <a:off x="0" y="0"/>
-                      <a:ext cx="5212080" cy="1551804"/>
+                      <a:ext cx="5303520" cy="1896646"/>
                     </a:xfrm>
                     <a:prstGeom prst="rect"/>
                   </pic:spPr>
@@ -3100,13 +3212,27 @@
     </w:p>
     <w:p>
       <w:pPr>
+        <w:spacing w:after="160"/>
+        <w:jc w:val="center"/>
+      </w:pPr>
+      <w:r>
+        <w:rPr>
+          <w:b w:val="0"/>
+          <w:color w:val="505050"/>
+          <w:sz w:val="16"/>
+        </w:rPr>
+        <w:t>Cercano al promedio 23/08/2026 — 41 m³ · Fuente: APP WES</w:t>
+      </w:r>
+    </w:p>
+    <w:p>
+      <w:pPr>
         <w:spacing w:after="40"/>
         <w:jc w:val="center"/>
       </w:pPr>
       <w:r>
         <w:drawing>
           <wp:inline xmlns:a="http://schemas.openxmlformats.org/drawingml/2006/main" xmlns:pic="http://schemas.openxmlformats.org/drawingml/2006/picture">
-            <wp:extent cx="5212080" cy="1551804"/>
+            <wp:extent cx="5303520" cy="1896646"/>
             <wp:docPr id="17" name="Picture 17"/>
             <wp:cNvGraphicFramePr>
               <a:graphicFrameLocks noChangeAspect="1"/>
@@ -3127,7 +3253,7 @@
                   <pic:spPr>
                     <a:xfrm>
                       <a:off x="0" y="0"/>
-                      <a:ext cx="5212080" cy="1551804"/>
+                      <a:ext cx="5303520" cy="1896646"/>
                     </a:xfrm>
                     <a:prstGeom prst="rect"/>
                   </pic:spPr>
@@ -3136,6 +3262,20 @@
             </a:graphic>
           </wp:inline>
         </w:drawing>
+      </w:r>
+    </w:p>
+    <w:p>
+      <w:pPr>
+        <w:spacing w:after="160"/>
+        <w:jc w:val="center"/>
+      </w:pPr>
+      <w:r>
+        <w:rPr>
+          <w:b w:val="0"/>
+          <w:color w:val="505050"/>
+          <w:sz w:val="16"/>
+        </w:rPr>
+        <w:t>Cercano al promedio 19/08/2026 — 43,3 m³ · Fuente: APP WES</w:t>
       </w:r>
     </w:p>
     <w:p>
@@ -3931,7 +4071,7 @@
           <w:color w:val="003366"/>
           <w:sz w:val="22"/>
         </w:rPr>
-        <w:t>Perfiles 24 h — Sexto Piso</w:t>
+        <w:t>Monitoreo Inteligente WES / Perfil hídrico horario — Sexto Piso</w:t>
       </w:r>
     </w:p>
     <w:p>
@@ -3945,7 +4085,7 @@
           <w:color w:val="000000"/>
           <w:sz w:val="20"/>
         </w:rPr>
-        <w:t>Día máximo, día mínimo y tres días con consumo más cercano al promedio (5 m³/día).</w:t>
+        <w:t>Curvas 24 h (m³/hr) del día máximo, del día mínimo y de tres días con consumo más cercano al promedio (5 m³/día). Fuente: App WES.</w:t>
       </w:r>
     </w:p>
     <w:p>
@@ -3956,7 +4096,7 @@
       <w:r>
         <w:drawing>
           <wp:inline xmlns:a="http://schemas.openxmlformats.org/drawingml/2006/main" xmlns:pic="http://schemas.openxmlformats.org/drawingml/2006/picture">
-            <wp:extent cx="5394960" cy="1606254"/>
+            <wp:extent cx="5440680" cy="1945697"/>
             <wp:docPr id="20" name="Picture 20"/>
             <wp:cNvGraphicFramePr>
               <a:graphicFrameLocks noChangeAspect="1"/>
@@ -3977,7 +4117,7 @@
                   <pic:spPr>
                     <a:xfrm>
                       <a:off x="0" y="0"/>
-                      <a:ext cx="5394960" cy="1606254"/>
+                      <a:ext cx="5440680" cy="1945697"/>
                     </a:xfrm>
                     <a:prstGeom prst="rect"/>
                   </pic:spPr>
@@ -3990,13 +4130,27 @@
     </w:p>
     <w:p>
       <w:pPr>
+        <w:spacing w:after="160"/>
+        <w:jc w:val="center"/>
+      </w:pPr>
+      <w:r>
+        <w:rPr>
+          <w:b w:val="0"/>
+          <w:color w:val="505050"/>
+          <w:sz w:val="16"/>
+        </w:rPr>
+        <w:t>Día máximo 08/08/2026 — 12,1 m³ · Fuente: APP WES</w:t>
+      </w:r>
+    </w:p>
+    <w:p>
+      <w:pPr>
         <w:spacing w:after="40"/>
         <w:jc w:val="center"/>
       </w:pPr>
       <w:r>
         <w:drawing>
           <wp:inline xmlns:a="http://schemas.openxmlformats.org/drawingml/2006/main" xmlns:pic="http://schemas.openxmlformats.org/drawingml/2006/picture">
-            <wp:extent cx="5394960" cy="1606254"/>
+            <wp:extent cx="5440680" cy="1945697"/>
             <wp:docPr id="21" name="Picture 21"/>
             <wp:cNvGraphicFramePr>
               <a:graphicFrameLocks noChangeAspect="1"/>
@@ -4017,7 +4171,7 @@
                   <pic:spPr>
                     <a:xfrm>
                       <a:off x="0" y="0"/>
-                      <a:ext cx="5394960" cy="1606254"/>
+                      <a:ext cx="5440680" cy="1945697"/>
                     </a:xfrm>
                     <a:prstGeom prst="rect"/>
                   </pic:spPr>
@@ -4026,6 +4180,20 @@
             </a:graphic>
           </wp:inline>
         </w:drawing>
+      </w:r>
+    </w:p>
+    <w:p>
+      <w:pPr>
+        <w:spacing w:after="160"/>
+        <w:jc w:val="center"/>
+      </w:pPr>
+      <w:r>
+        <w:rPr>
+          <w:b w:val="0"/>
+          <w:color w:val="505050"/>
+          <w:sz w:val="16"/>
+        </w:rPr>
+        <w:t>Día mínimo 18/08/2026 — 1,4 m³ · Fuente: APP WES</w:t>
       </w:r>
     </w:p>
     <w:p>
@@ -4068,7 +4236,7 @@
       <w:r>
         <w:drawing>
           <wp:inline xmlns:a="http://schemas.openxmlformats.org/drawingml/2006/main" xmlns:pic="http://schemas.openxmlformats.org/drawingml/2006/picture">
-            <wp:extent cx="5212080" cy="1551804"/>
+            <wp:extent cx="5303520" cy="1896646"/>
             <wp:docPr id="22" name="Picture 22"/>
             <wp:cNvGraphicFramePr>
               <a:graphicFrameLocks noChangeAspect="1"/>
@@ -4089,7 +4257,7 @@
                   <pic:spPr>
                     <a:xfrm>
                       <a:off x="0" y="0"/>
-                      <a:ext cx="5212080" cy="1551804"/>
+                      <a:ext cx="5303520" cy="1896646"/>
                     </a:xfrm>
                     <a:prstGeom prst="rect"/>
                   </pic:spPr>
@@ -4102,13 +4270,27 @@
     </w:p>
     <w:p>
       <w:pPr>
+        <w:spacing w:after="160"/>
+        <w:jc w:val="center"/>
+      </w:pPr>
+      <w:r>
+        <w:rPr>
+          <w:b w:val="0"/>
+          <w:color w:val="505050"/>
+          <w:sz w:val="16"/>
+        </w:rPr>
+        <w:t>Cercano al promedio 10/09/2026 — 5 m³ · Fuente: APP WES</w:t>
+      </w:r>
+    </w:p>
+    <w:p>
+      <w:pPr>
         <w:spacing w:after="40"/>
         <w:jc w:val="center"/>
       </w:pPr>
       <w:r>
         <w:drawing>
           <wp:inline xmlns:a="http://schemas.openxmlformats.org/drawingml/2006/main" xmlns:pic="http://schemas.openxmlformats.org/drawingml/2006/picture">
-            <wp:extent cx="5212080" cy="1551804"/>
+            <wp:extent cx="5303520" cy="1896646"/>
             <wp:docPr id="23" name="Picture 23"/>
             <wp:cNvGraphicFramePr>
               <a:graphicFrameLocks noChangeAspect="1"/>
@@ -4129,7 +4311,7 @@
                   <pic:spPr>
                     <a:xfrm>
                       <a:off x="0" y="0"/>
-                      <a:ext cx="5212080" cy="1551804"/>
+                      <a:ext cx="5303520" cy="1896646"/>
                     </a:xfrm>
                     <a:prstGeom prst="rect"/>
                   </pic:spPr>
@@ -4142,13 +4324,27 @@
     </w:p>
     <w:p>
       <w:pPr>
+        <w:spacing w:after="160"/>
+        <w:jc w:val="center"/>
+      </w:pPr>
+      <w:r>
+        <w:rPr>
+          <w:b w:val="0"/>
+          <w:color w:val="505050"/>
+          <w:sz w:val="16"/>
+        </w:rPr>
+        <w:t>Cercano al promedio 24/08/2026 — 4,9 m³ · Fuente: APP WES</w:t>
+      </w:r>
+    </w:p>
+    <w:p>
+      <w:pPr>
         <w:spacing w:after="40"/>
         <w:jc w:val="center"/>
       </w:pPr>
       <w:r>
         <w:drawing>
           <wp:inline xmlns:a="http://schemas.openxmlformats.org/drawingml/2006/main" xmlns:pic="http://schemas.openxmlformats.org/drawingml/2006/picture">
-            <wp:extent cx="5212080" cy="1551804"/>
+            <wp:extent cx="5303520" cy="1896646"/>
             <wp:docPr id="24" name="Picture 24"/>
             <wp:cNvGraphicFramePr>
               <a:graphicFrameLocks noChangeAspect="1"/>
@@ -4169,7 +4365,7 @@
                   <pic:spPr>
                     <a:xfrm>
                       <a:off x="0" y="0"/>
-                      <a:ext cx="5212080" cy="1551804"/>
+                      <a:ext cx="5303520" cy="1896646"/>
                     </a:xfrm>
                     <a:prstGeom prst="rect"/>
                   </pic:spPr>
@@ -4178,6 +4374,20 @@
             </a:graphic>
           </wp:inline>
         </w:drawing>
+      </w:r>
+    </w:p>
+    <w:p>
+      <w:pPr>
+        <w:spacing w:after="160"/>
+        <w:jc w:val="center"/>
+      </w:pPr>
+      <w:r>
+        <w:rPr>
+          <w:b w:val="0"/>
+          <w:color w:val="505050"/>
+          <w:sz w:val="16"/>
+        </w:rPr>
+        <w:t>Cercano al promedio 11/09/2026 — 4,9 m³ · Fuente: APP WES</w:t>
       </w:r>
     </w:p>
     <w:p>
@@ -5979,7 +6189,7 @@
           <w:color w:val="000000"/>
           <w:sz w:val="16"/>
         </w:rPr>
-        <w:t>Documento generado 20/10/2026 19:20 · WES · Clínica Bupa Antofagasta</w:t>
+        <w:t>Documento generado 20/10/2026 19:38 · WES · Clínica Bupa Antofagasta</w:t>
       </w:r>
     </w:p>
     <w:sectPr>

</xml_diff>

<commit_message>
Polish Bupa Antofagasta report visuals: softer WES styling.
Replace navy header blocks with light WES table headers, tone down bold
typography, and refine charts to a cleaner App-like area style.

Co-authored-by: anibaloperacionesWes <anibaloperacionesWes@users.noreply.github.com>
</commit_message>
<xml_diff>
--- a/reports/Bupa_Antofagasta/INFORME_FINAL/Informe_final_WES_Bupa_Antofagasta_20260731_20260930.docx
+++ b/reports/Bupa_Antofagasta/INFORME_FINAL/Informe_final_WES_Bupa_Antofagasta_20260731_20260930.docx
@@ -84,12 +84,12 @@
     </w:p>
     <w:p>
       <w:pPr>
-        <w:spacing w:before="160" w:after="120"/>
+        <w:spacing w:before="200" w:after="120"/>
       </w:pPr>
       <w:r>
         <w:rPr>
           <w:b/>
-          <w:color w:val="003366"/>
+          <w:color w:val="2F5496"/>
           <w:sz w:val="32"/>
         </w:rPr>
         <w:t>Índice</w:t>
@@ -282,25 +282,25 @@
     </w:p>
     <w:p>
       <w:pPr>
-        <w:spacing w:before="160" w:after="120"/>
+        <w:spacing w:before="200" w:after="120"/>
       </w:pPr>
       <w:r>
         <w:rPr>
           <w:b/>
-          <w:color w:val="003366"/>
-          <w:sz w:val="28"/>
+          <w:color w:val="2F5496"/>
+          <w:sz w:val="26"/>
         </w:rPr>
         <w:t>Resumen Ejecutivo</w:t>
       </w:r>
     </w:p>
     <w:p>
       <w:pPr>
-        <w:spacing w:before="120" w:after="80"/>
+        <w:spacing w:before="160" w:after="80"/>
       </w:pPr>
       <w:r>
         <w:rPr>
           <w:b/>
-          <w:color w:val="003366"/>
+          <w:color w:val="374151"/>
           <w:sz w:val="22"/>
         </w:rPr>
         <w:t>Propósito y Alcance</w:t>
@@ -338,12 +338,12 @@
     </w:p>
     <w:p>
       <w:pPr>
-        <w:spacing w:before="120" w:after="80"/>
+        <w:spacing w:before="160" w:after="80"/>
       </w:pPr>
       <w:r>
         <w:rPr>
           <w:b/>
-          <w:color w:val="003366"/>
+          <w:color w:val="374151"/>
           <w:sz w:val="22"/>
         </w:rPr>
         <w:t>Hallazgos Principales de Consumo</w:t>
@@ -399,12 +399,12 @@
     </w:p>
     <w:p>
       <w:pPr>
-        <w:spacing w:before="120" w:after="80"/>
+        <w:spacing w:before="160" w:after="80"/>
       </w:pPr>
       <w:r>
         <w:rPr>
           <w:b/>
-          <w:color w:val="003366"/>
+          <w:color w:val="374151"/>
           <w:sz w:val="22"/>
         </w:rPr>
         <w:t>Recomendaciones Estratégicas</w:t>
@@ -465,13 +465,13 @@
     </w:p>
     <w:p>
       <w:pPr>
-        <w:spacing w:before="160" w:after="120"/>
+        <w:spacing w:before="200" w:after="120"/>
       </w:pPr>
       <w:r>
         <w:rPr>
           <w:b/>
-          <w:color w:val="003366"/>
-          <w:sz w:val="28"/>
+          <w:color w:val="2F5496"/>
+          <w:sz w:val="26"/>
         </w:rPr>
         <w:t>I. Antecedentes</w:t>
       </w:r>
@@ -523,12 +523,12 @@
     </w:p>
     <w:p>
       <w:pPr>
-        <w:spacing w:before="120" w:after="80"/>
+        <w:spacing w:before="160" w:after="80"/>
       </w:pPr>
       <w:r>
         <w:rPr>
           <w:b/>
-          <w:color w:val="003366"/>
+          <w:color w:val="374151"/>
           <w:sz w:val="22"/>
         </w:rPr>
         <w:t>a. Hitos</w:t>
@@ -611,12 +611,12 @@
     </w:p>
     <w:p>
       <w:pPr>
-        <w:spacing w:before="120" w:after="80"/>
+        <w:spacing w:before="160" w:after="80"/>
       </w:pPr>
       <w:r>
         <w:rPr>
           <w:b/>
-          <w:color w:val="003366"/>
+          <w:color w:val="374151"/>
           <w:sz w:val="22"/>
         </w:rPr>
         <w:t>Ubicación</w:t>
@@ -637,7 +637,7 @@
         <w:tc>
           <w:tcPr>
             <w:tcW w:type="dxa" w:w="4968"/>
-            <w:shd w:fill="003366" w:val="clear"/>
+            <w:shd w:fill="D9E1F2" w:val="clear"/>
           </w:tcPr>
           <w:p>
             <w:pPr>
@@ -646,7 +646,7 @@
             <w:r>
               <w:rPr>
                 <w:b/>
-                <w:color w:val="FFFFFF"/>
+                <w:color w:val="1F3864"/>
                 <w:sz w:val="18"/>
               </w:rPr>
               <w:t>Recinto</w:t>
@@ -656,7 +656,7 @@
         <w:tc>
           <w:tcPr>
             <w:tcW w:type="dxa" w:w="4968"/>
-            <w:shd w:fill="003366" w:val="clear"/>
+            <w:shd w:fill="D9E1F2" w:val="clear"/>
           </w:tcPr>
           <w:p>
             <w:pPr>
@@ -665,7 +665,7 @@
             <w:r>
               <w:rPr>
                 <w:b/>
-                <w:color w:val="FFFFFF"/>
+                <w:color w:val="1F3864"/>
                 <w:sz w:val="18"/>
               </w:rPr>
               <w:t>Dirección</w:t>
@@ -726,13 +726,13 @@
     </w:p>
     <w:p>
       <w:pPr>
-        <w:spacing w:before="160" w:after="120"/>
+        <w:spacing w:before="200" w:after="120"/>
       </w:pPr>
       <w:r>
         <w:rPr>
           <w:b/>
-          <w:color w:val="003366"/>
-          <w:sz w:val="28"/>
+          <w:color w:val="2F5496"/>
+          <w:sz w:val="26"/>
         </w:rPr>
         <w:t>II. Objetivos y resultados esperados</w:t>
       </w:r>
@@ -798,13 +798,13 @@
     </w:p>
     <w:p>
       <w:pPr>
-        <w:spacing w:before="160" w:after="120"/>
+        <w:spacing w:before="200" w:after="120"/>
       </w:pPr>
       <w:r>
         <w:rPr>
           <w:b/>
-          <w:color w:val="003366"/>
-          <w:sz w:val="28"/>
+          <w:color w:val="2F5496"/>
+          <w:sz w:val="26"/>
         </w:rPr>
         <w:t>III. Definición de sectores a monitorear</w:t>
       </w:r>
@@ -875,13 +875,13 @@
     </w:p>
     <w:p>
       <w:pPr>
-        <w:spacing w:before="160" w:after="120"/>
+        <w:spacing w:before="200" w:after="120"/>
       </w:pPr>
       <w:r>
         <w:rPr>
           <w:b/>
-          <w:color w:val="003366"/>
-          <w:sz w:val="28"/>
+          <w:color w:val="2F5496"/>
+          <w:sz w:val="26"/>
         </w:rPr>
         <w:t>IV. Fotografías de instalación</w:t>
       </w:r>
@@ -1114,13 +1114,13 @@
     </w:p>
     <w:p>
       <w:pPr>
-        <w:spacing w:before="160" w:after="120"/>
+        <w:spacing w:before="200" w:after="120"/>
       </w:pPr>
       <w:r>
         <w:rPr>
           <w:b/>
-          <w:color w:val="003366"/>
-          <w:sz w:val="28"/>
+          <w:color w:val="2F5496"/>
+          <w:sz w:val="26"/>
         </w:rPr>
         <w:t>V. Análisis de sectores monitoreados</w:t>
       </w:r>
@@ -1141,12 +1141,12 @@
     </w:p>
     <w:p>
       <w:pPr>
-        <w:spacing w:before="120" w:after="80"/>
+        <w:spacing w:before="160" w:after="80"/>
       </w:pPr>
       <w:r>
         <w:rPr>
           <w:b/>
-          <w:color w:val="003366"/>
+          <w:color w:val="374151"/>
           <w:sz w:val="22"/>
         </w:rPr>
         <w:t>1) Medidor Principal Sanitaria</w:t>
@@ -1167,6 +1167,7 @@
         <w:tc>
           <w:tcPr>
             <w:tcW w:type="dxa" w:w="4968"/>
+            <w:shd w:fill="F7F9FC" w:val="clear"/>
           </w:tcPr>
           <w:p>
             <w:pPr>
@@ -1175,8 +1176,8 @@
             <w:r/>
             <w:r>
               <w:rPr>
-                <w:b/>
-                <w:color w:val="000000"/>
+                <w:b w:val="0"/>
+                <w:color w:val="374151"/>
                 <w:sz w:val="18"/>
               </w:rPr>
               <w:t>Total (m³)</w:t>
@@ -1186,6 +1187,7 @@
         <w:tc>
           <w:tcPr>
             <w:tcW w:type="dxa" w:w="4968"/>
+            <w:shd w:fill="F7F9FC" w:val="clear"/>
           </w:tcPr>
           <w:p>
             <w:pPr>
@@ -1195,7 +1197,7 @@
             <w:r>
               <w:rPr>
                 <w:b w:val="0"/>
-                <w:color w:val="000000"/>
+                <w:color w:val="111827"/>
                 <w:sz w:val="18"/>
               </w:rPr>
               <w:t>4.646,1</w:t>
@@ -1215,8 +1217,8 @@
             <w:r/>
             <w:r>
               <w:rPr>
-                <w:b/>
-                <w:color w:val="000000"/>
+                <w:b w:val="0"/>
+                <w:color w:val="374151"/>
                 <w:sz w:val="18"/>
               </w:rPr>
               <w:t>Promedio mensual (m³)</w:t>
@@ -1235,7 +1237,7 @@
             <w:r>
               <w:rPr>
                 <w:b w:val="0"/>
-                <w:color w:val="000000"/>
+                <w:color w:val="111827"/>
                 <w:sz w:val="18"/>
               </w:rPr>
               <w:t>2.248,1</w:t>
@@ -1247,6 +1249,7 @@
         <w:tc>
           <w:tcPr>
             <w:tcW w:type="dxa" w:w="4968"/>
+            <w:shd w:fill="F7F9FC" w:val="clear"/>
           </w:tcPr>
           <w:p>
             <w:pPr>
@@ -1255,8 +1258,8 @@
             <w:r/>
             <w:r>
               <w:rPr>
-                <w:b/>
-                <w:color w:val="000000"/>
+                <w:b w:val="0"/>
+                <w:color w:val="374151"/>
                 <w:sz w:val="18"/>
               </w:rPr>
               <w:t>Promedio diario (m³)</w:t>
@@ -1266,6 +1269,7 @@
         <w:tc>
           <w:tcPr>
             <w:tcW w:type="dxa" w:w="4968"/>
+            <w:shd w:fill="F7F9FC" w:val="clear"/>
           </w:tcPr>
           <w:p>
             <w:pPr>
@@ -1275,7 +1279,7 @@
             <w:r>
               <w:rPr>
                 <w:b w:val="0"/>
-                <w:color w:val="000000"/>
+                <w:color w:val="111827"/>
                 <w:sz w:val="18"/>
               </w:rPr>
               <w:t>74,9</w:t>
@@ -1295,8 +1299,8 @@
             <w:r/>
             <w:r>
               <w:rPr>
-                <w:b/>
-                <w:color w:val="000000"/>
+                <w:b w:val="0"/>
+                <w:color w:val="374151"/>
                 <w:sz w:val="18"/>
               </w:rPr>
               <w:t>Días con data</w:t>
@@ -1315,7 +1319,7 @@
             <w:r>
               <w:rPr>
                 <w:b w:val="0"/>
-                <w:color w:val="000000"/>
+                <w:color w:val="111827"/>
                 <w:sz w:val="18"/>
               </w:rPr>
               <w:t>62 / 62</w:t>
@@ -1327,6 +1331,7 @@
         <w:tc>
           <w:tcPr>
             <w:tcW w:type="dxa" w:w="4968"/>
+            <w:shd w:fill="F7F9FC" w:val="clear"/>
           </w:tcPr>
           <w:p>
             <w:pPr>
@@ -1335,8 +1340,8 @@
             <w:r/>
             <w:r>
               <w:rPr>
-                <w:b/>
-                <w:color w:val="000000"/>
+                <w:b w:val="0"/>
+                <w:color w:val="374151"/>
                 <w:sz w:val="18"/>
               </w:rPr>
               <w:t>Rango min y max diario (m³)</w:t>
@@ -1346,6 +1351,7 @@
         <w:tc>
           <w:tcPr>
             <w:tcW w:type="dxa" w:w="4968"/>
+            <w:shd w:fill="F7F9FC" w:val="clear"/>
           </w:tcPr>
           <w:p>
             <w:pPr>
@@ -1355,7 +1361,7 @@
             <w:r>
               <w:rPr>
                 <w:b w:val="0"/>
-                <w:color w:val="000000"/>
+                <w:color w:val="111827"/>
                 <w:sz w:val="18"/>
               </w:rPr>
               <w:t>16,4 – 162,3 m³ (29/09/2026 / 28/08/2026)</w:t>
@@ -1375,8 +1381,8 @@
             <w:r/>
             <w:r>
               <w:rPr>
-                <w:b/>
-                <w:color w:val="000000"/>
+                <w:b w:val="0"/>
+                <w:color w:val="374151"/>
                 <w:sz w:val="18"/>
               </w:rPr>
               <w:t>% sobre Sanitaria</w:t>
@@ -1395,7 +1401,7 @@
             <w:r>
               <w:rPr>
                 <w:b w:val="0"/>
-                <w:color w:val="000000"/>
+                <w:color w:val="111827"/>
                 <w:sz w:val="18"/>
               </w:rPr>
               <w:t>100,0%</w:t>
@@ -1406,7 +1412,7 @@
     </w:tbl>
     <w:p>
       <w:pPr>
-        <w:spacing w:after="80"/>
+        <w:spacing w:after="120"/>
       </w:pPr>
     </w:p>
     <w:p>
@@ -1417,7 +1423,7 @@
       <w:r>
         <w:drawing>
           <wp:inline xmlns:a="http://schemas.openxmlformats.org/drawingml/2006/main" xmlns:pic="http://schemas.openxmlformats.org/drawingml/2006/picture">
-            <wp:extent cx="5440680" cy="1566729"/>
+            <wp:extent cx="5440680" cy="1523540"/>
             <wp:docPr id="4" name="Picture 4"/>
             <wp:cNvGraphicFramePr>
               <a:graphicFrameLocks noChangeAspect="1"/>
@@ -1438,7 +1444,7 @@
                   <pic:spPr>
                     <a:xfrm>
                       <a:off x="0" y="0"/>
-                      <a:ext cx="5440680" cy="1566729"/>
+                      <a:ext cx="5440680" cy="1523540"/>
                     </a:xfrm>
                     <a:prstGeom prst="rect"/>
                   </pic:spPr>
@@ -1487,7 +1493,7 @@
       <w:r>
         <w:drawing>
           <wp:inline xmlns:a="http://schemas.openxmlformats.org/drawingml/2006/main" xmlns:pic="http://schemas.openxmlformats.org/drawingml/2006/picture">
-            <wp:extent cx="5303520" cy="1436532"/>
+            <wp:extent cx="5303520" cy="1430873"/>
             <wp:docPr id="5" name="Picture 5"/>
             <wp:cNvGraphicFramePr>
               <a:graphicFrameLocks noChangeAspect="1"/>
@@ -1508,7 +1514,7 @@
                   <pic:spPr>
                     <a:xfrm>
                       <a:off x="0" y="0"/>
-                      <a:ext cx="5303520" cy="1436532"/>
+                      <a:ext cx="5303520" cy="1430873"/>
                     </a:xfrm>
                     <a:prstGeom prst="rect"/>
                   </pic:spPr>
@@ -1534,7 +1540,7 @@
         <w:tc>
           <w:tcPr>
             <w:tcW w:type="dxa" w:w="4968"/>
-            <w:shd w:fill="003366" w:val="clear"/>
+            <w:shd w:fill="D9E1F2" w:val="clear"/>
           </w:tcPr>
           <w:p>
             <w:pPr>
@@ -1543,7 +1549,7 @@
             <w:r>
               <w:rPr>
                 <w:b/>
-                <w:color w:val="FFFFFF"/>
+                <w:color w:val="1F3864"/>
                 <w:sz w:val="18"/>
               </w:rPr>
               <w:t>Día</w:t>
@@ -1553,7 +1559,7 @@
         <w:tc>
           <w:tcPr>
             <w:tcW w:type="dxa" w:w="4968"/>
-            <w:shd w:fill="003366" w:val="clear"/>
+            <w:shd w:fill="D9E1F2" w:val="clear"/>
           </w:tcPr>
           <w:p>
             <w:pPr>
@@ -1562,7 +1568,7 @@
             <w:r>
               <w:rPr>
                 <w:b/>
-                <w:color w:val="FFFFFF"/>
+                <w:color w:val="1F3864"/>
                 <w:sz w:val="18"/>
               </w:rPr>
               <w:t>Promedio (m³)</w:t>
@@ -1879,12 +1885,12 @@
     </w:p>
     <w:p>
       <w:pPr>
-        <w:spacing w:before="120" w:after="80"/>
+        <w:spacing w:before="160" w:after="80"/>
       </w:pPr>
       <w:r>
         <w:rPr>
           <w:b/>
-          <w:color w:val="003366"/>
+          <w:color w:val="374151"/>
           <w:sz w:val="22"/>
         </w:rPr>
         <w:t>Monitoreo Inteligente WES / Perfil hídrico horario — Sanitaria</w:t>
@@ -1912,7 +1918,7 @@
       <w:r>
         <w:drawing>
           <wp:inline xmlns:a="http://schemas.openxmlformats.org/drawingml/2006/main" xmlns:pic="http://schemas.openxmlformats.org/drawingml/2006/picture">
-            <wp:extent cx="5440680" cy="1945697"/>
+            <wp:extent cx="5440680" cy="1927682"/>
             <wp:docPr id="6" name="Picture 6"/>
             <wp:cNvGraphicFramePr>
               <a:graphicFrameLocks noChangeAspect="1"/>
@@ -1933,7 +1939,7 @@
                   <pic:spPr>
                     <a:xfrm>
                       <a:off x="0" y="0"/>
-                      <a:ext cx="5440680" cy="1945697"/>
+                      <a:ext cx="5440680" cy="1927682"/>
                     </a:xfrm>
                     <a:prstGeom prst="rect"/>
                   </pic:spPr>
@@ -1966,7 +1972,7 @@
       <w:r>
         <w:drawing>
           <wp:inline xmlns:a="http://schemas.openxmlformats.org/drawingml/2006/main" xmlns:pic="http://schemas.openxmlformats.org/drawingml/2006/picture">
-            <wp:extent cx="5440680" cy="1945697"/>
+            <wp:extent cx="5440680" cy="1927682"/>
             <wp:docPr id="7" name="Picture 7"/>
             <wp:cNvGraphicFramePr>
               <a:graphicFrameLocks noChangeAspect="1"/>
@@ -1987,7 +1993,7 @@
                   <pic:spPr>
                     <a:xfrm>
                       <a:off x="0" y="0"/>
-                      <a:ext cx="5440680" cy="1945697"/>
+                      <a:ext cx="5440680" cy="1927682"/>
                     </a:xfrm>
                     <a:prstGeom prst="rect"/>
                   </pic:spPr>
@@ -2019,12 +2025,12 @@
     </w:p>
     <w:p>
       <w:pPr>
-        <w:spacing w:before="120" w:after="80"/>
+        <w:spacing w:before="160" w:after="80"/>
       </w:pPr>
       <w:r>
         <w:rPr>
           <w:b/>
-          <w:color w:val="003366"/>
+          <w:color w:val="374151"/>
           <w:sz w:val="22"/>
         </w:rPr>
         <w:t>Días cercanos al promedio — Sanitaria</w:t>
@@ -2052,7 +2058,7 @@
       <w:r>
         <w:drawing>
           <wp:inline xmlns:a="http://schemas.openxmlformats.org/drawingml/2006/main" xmlns:pic="http://schemas.openxmlformats.org/drawingml/2006/picture">
-            <wp:extent cx="5303520" cy="1896646"/>
+            <wp:extent cx="5303520" cy="1879085"/>
             <wp:docPr id="8" name="Picture 8"/>
             <wp:cNvGraphicFramePr>
               <a:graphicFrameLocks noChangeAspect="1"/>
@@ -2073,7 +2079,7 @@
                   <pic:spPr>
                     <a:xfrm>
                       <a:off x="0" y="0"/>
-                      <a:ext cx="5303520" cy="1896646"/>
+                      <a:ext cx="5303520" cy="1879085"/>
                     </a:xfrm>
                     <a:prstGeom prst="rect"/>
                   </pic:spPr>
@@ -2106,7 +2112,7 @@
       <w:r>
         <w:drawing>
           <wp:inline xmlns:a="http://schemas.openxmlformats.org/drawingml/2006/main" xmlns:pic="http://schemas.openxmlformats.org/drawingml/2006/picture">
-            <wp:extent cx="5303520" cy="1896646"/>
+            <wp:extent cx="5303520" cy="1879085"/>
             <wp:docPr id="9" name="Picture 9"/>
             <wp:cNvGraphicFramePr>
               <a:graphicFrameLocks noChangeAspect="1"/>
@@ -2127,7 +2133,7 @@
                   <pic:spPr>
                     <a:xfrm>
                       <a:off x="0" y="0"/>
-                      <a:ext cx="5303520" cy="1896646"/>
+                      <a:ext cx="5303520" cy="1879085"/>
                     </a:xfrm>
                     <a:prstGeom prst="rect"/>
                   </pic:spPr>
@@ -2160,7 +2166,7 @@
       <w:r>
         <w:drawing>
           <wp:inline xmlns:a="http://schemas.openxmlformats.org/drawingml/2006/main" xmlns:pic="http://schemas.openxmlformats.org/drawingml/2006/picture">
-            <wp:extent cx="5303520" cy="1896646"/>
+            <wp:extent cx="5303520" cy="1879085"/>
             <wp:docPr id="10" name="Picture 10"/>
             <wp:cNvGraphicFramePr>
               <a:graphicFrameLocks noChangeAspect="1"/>
@@ -2181,7 +2187,7 @@
                   <pic:spPr>
                     <a:xfrm>
                       <a:off x="0" y="0"/>
-                      <a:ext cx="5303520" cy="1896646"/>
+                      <a:ext cx="5303520" cy="1879085"/>
                     </a:xfrm>
                     <a:prstGeom prst="rect"/>
                   </pic:spPr>
@@ -2213,12 +2219,12 @@
     </w:p>
     <w:p>
       <w:pPr>
-        <w:spacing w:before="120" w:after="80"/>
+        <w:spacing w:before="160" w:after="80"/>
       </w:pPr>
       <w:r>
         <w:rPr>
           <w:b/>
-          <w:color w:val="003366"/>
+          <w:color w:val="374151"/>
           <w:sz w:val="22"/>
         </w:rPr>
         <w:t>2) Sala de Bomba Principal (Primer Piso)</w:t>
@@ -2239,6 +2245,7 @@
         <w:tc>
           <w:tcPr>
             <w:tcW w:type="dxa" w:w="4968"/>
+            <w:shd w:fill="F7F9FC" w:val="clear"/>
           </w:tcPr>
           <w:p>
             <w:pPr>
@@ -2247,8 +2254,8 @@
             <w:r/>
             <w:r>
               <w:rPr>
-                <w:b/>
-                <w:color w:val="000000"/>
+                <w:b w:val="0"/>
+                <w:color w:val="374151"/>
                 <w:sz w:val="18"/>
               </w:rPr>
               <w:t>Total (m³)</w:t>
@@ -2258,6 +2265,7 @@
         <w:tc>
           <w:tcPr>
             <w:tcW w:type="dxa" w:w="4968"/>
+            <w:shd w:fill="F7F9FC" w:val="clear"/>
           </w:tcPr>
           <w:p>
             <w:pPr>
@@ -2267,7 +2275,7 @@
             <w:r>
               <w:rPr>
                 <w:b w:val="0"/>
-                <w:color w:val="000000"/>
+                <w:color w:val="111827"/>
                 <w:sz w:val="18"/>
               </w:rPr>
               <w:t>2.523,7</w:t>
@@ -2287,8 +2295,8 @@
             <w:r/>
             <w:r>
               <w:rPr>
-                <w:b/>
-                <w:color w:val="000000"/>
+                <w:b w:val="0"/>
+                <w:color w:val="374151"/>
                 <w:sz w:val="18"/>
               </w:rPr>
               <w:t>Promedio mensual (m³)</w:t>
@@ -2307,7 +2315,7 @@
             <w:r>
               <w:rPr>
                 <w:b w:val="0"/>
-                <w:color w:val="000000"/>
+                <w:color w:val="111827"/>
                 <w:sz w:val="18"/>
               </w:rPr>
               <w:t>1.221,2</w:t>
@@ -2319,6 +2327,7 @@
         <w:tc>
           <w:tcPr>
             <w:tcW w:type="dxa" w:w="4968"/>
+            <w:shd w:fill="F7F9FC" w:val="clear"/>
           </w:tcPr>
           <w:p>
             <w:pPr>
@@ -2327,8 +2336,8 @@
             <w:r/>
             <w:r>
               <w:rPr>
-                <w:b/>
-                <w:color w:val="000000"/>
+                <w:b w:val="0"/>
+                <w:color w:val="374151"/>
                 <w:sz w:val="18"/>
               </w:rPr>
               <w:t>Promedio diario (m³)</w:t>
@@ -2338,6 +2347,7 @@
         <w:tc>
           <w:tcPr>
             <w:tcW w:type="dxa" w:w="4968"/>
+            <w:shd w:fill="F7F9FC" w:val="clear"/>
           </w:tcPr>
           <w:p>
             <w:pPr>
@@ -2347,7 +2357,7 @@
             <w:r>
               <w:rPr>
                 <w:b w:val="0"/>
-                <w:color w:val="000000"/>
+                <w:color w:val="111827"/>
                 <w:sz w:val="18"/>
               </w:rPr>
               <w:t>40,7</w:t>
@@ -2367,8 +2377,8 @@
             <w:r/>
             <w:r>
               <w:rPr>
-                <w:b/>
-                <w:color w:val="000000"/>
+                <w:b w:val="0"/>
+                <w:color w:val="374151"/>
                 <w:sz w:val="18"/>
               </w:rPr>
               <w:t>Días con data</w:t>
@@ -2387,7 +2397,7 @@
             <w:r>
               <w:rPr>
                 <w:b w:val="0"/>
-                <w:color w:val="000000"/>
+                <w:color w:val="111827"/>
                 <w:sz w:val="18"/>
               </w:rPr>
               <w:t>62 / 62</w:t>
@@ -2399,6 +2409,7 @@
         <w:tc>
           <w:tcPr>
             <w:tcW w:type="dxa" w:w="4968"/>
+            <w:shd w:fill="F7F9FC" w:val="clear"/>
           </w:tcPr>
           <w:p>
             <w:pPr>
@@ -2407,8 +2418,8 @@
             <w:r/>
             <w:r>
               <w:rPr>
-                <w:b/>
-                <w:color w:val="000000"/>
+                <w:b w:val="0"/>
+                <w:color w:val="374151"/>
                 <w:sz w:val="18"/>
               </w:rPr>
               <w:t>Rango min y max diario (m³)</w:t>
@@ -2418,6 +2429,7 @@
         <w:tc>
           <w:tcPr>
             <w:tcW w:type="dxa" w:w="4968"/>
+            <w:shd w:fill="F7F9FC" w:val="clear"/>
           </w:tcPr>
           <w:p>
             <w:pPr>
@@ -2427,7 +2439,7 @@
             <w:r>
               <w:rPr>
                 <w:b w:val="0"/>
-                <w:color w:val="000000"/>
+                <w:color w:val="111827"/>
                 <w:sz w:val="18"/>
               </w:rPr>
               <w:t>1,8 – 68 m³ (27/09/2026 / 04/08/2026)</w:t>
@@ -2447,8 +2459,8 @@
             <w:r/>
             <w:r>
               <w:rPr>
-                <w:b/>
-                <w:color w:val="000000"/>
+                <w:b w:val="0"/>
+                <w:color w:val="374151"/>
                 <w:sz w:val="18"/>
               </w:rPr>
               <w:t>% sobre Sanitaria</w:t>
@@ -2467,7 +2479,7 @@
             <w:r>
               <w:rPr>
                 <w:b w:val="0"/>
-                <w:color w:val="000000"/>
+                <w:color w:val="111827"/>
                 <w:sz w:val="18"/>
               </w:rPr>
               <w:t>54,3%</w:t>
@@ -2478,7 +2490,7 @@
     </w:tbl>
     <w:p>
       <w:pPr>
-        <w:spacing w:after="80"/>
+        <w:spacing w:after="120"/>
       </w:pPr>
     </w:p>
     <w:p>
@@ -2489,7 +2501,7 @@
       <w:r>
         <w:drawing>
           <wp:inline xmlns:a="http://schemas.openxmlformats.org/drawingml/2006/main" xmlns:pic="http://schemas.openxmlformats.org/drawingml/2006/picture">
-            <wp:extent cx="5440680" cy="1566729"/>
+            <wp:extent cx="5440680" cy="1523540"/>
             <wp:docPr id="11" name="Picture 11"/>
             <wp:cNvGraphicFramePr>
               <a:graphicFrameLocks noChangeAspect="1"/>
@@ -2510,7 +2522,7 @@
                   <pic:spPr>
                     <a:xfrm>
                       <a:off x="0" y="0"/>
-                      <a:ext cx="5440680" cy="1566729"/>
+                      <a:ext cx="5440680" cy="1523540"/>
                     </a:xfrm>
                     <a:prstGeom prst="rect"/>
                   </pic:spPr>
@@ -2559,7 +2571,7 @@
       <w:r>
         <w:drawing>
           <wp:inline xmlns:a="http://schemas.openxmlformats.org/drawingml/2006/main" xmlns:pic="http://schemas.openxmlformats.org/drawingml/2006/picture">
-            <wp:extent cx="5303520" cy="1436532"/>
+            <wp:extent cx="5303520" cy="1430873"/>
             <wp:docPr id="12" name="Picture 12"/>
             <wp:cNvGraphicFramePr>
               <a:graphicFrameLocks noChangeAspect="1"/>
@@ -2580,7 +2592,7 @@
                   <pic:spPr>
                     <a:xfrm>
                       <a:off x="0" y="0"/>
-                      <a:ext cx="5303520" cy="1436532"/>
+                      <a:ext cx="5303520" cy="1430873"/>
                     </a:xfrm>
                     <a:prstGeom prst="rect"/>
                   </pic:spPr>
@@ -2606,7 +2618,7 @@
         <w:tc>
           <w:tcPr>
             <w:tcW w:type="dxa" w:w="4968"/>
-            <w:shd w:fill="003366" w:val="clear"/>
+            <w:shd w:fill="D9E1F2" w:val="clear"/>
           </w:tcPr>
           <w:p>
             <w:pPr>
@@ -2615,7 +2627,7 @@
             <w:r>
               <w:rPr>
                 <w:b/>
-                <w:color w:val="FFFFFF"/>
+                <w:color w:val="1F3864"/>
                 <w:sz w:val="18"/>
               </w:rPr>
               <w:t>Día</w:t>
@@ -2625,7 +2637,7 @@
         <w:tc>
           <w:tcPr>
             <w:tcW w:type="dxa" w:w="4968"/>
-            <w:shd w:fill="003366" w:val="clear"/>
+            <w:shd w:fill="D9E1F2" w:val="clear"/>
           </w:tcPr>
           <w:p>
             <w:pPr>
@@ -2634,7 +2646,7 @@
             <w:r>
               <w:rPr>
                 <w:b/>
-                <w:color w:val="FFFFFF"/>
+                <w:color w:val="1F3864"/>
                 <w:sz w:val="18"/>
               </w:rPr>
               <w:t>Promedio (m³)</w:t>
@@ -2951,12 +2963,12 @@
     </w:p>
     <w:p>
       <w:pPr>
-        <w:spacing w:before="120" w:after="80"/>
+        <w:spacing w:before="160" w:after="80"/>
       </w:pPr>
       <w:r>
         <w:rPr>
           <w:b/>
-          <w:color w:val="003366"/>
+          <w:color w:val="374151"/>
           <w:sz w:val="22"/>
         </w:rPr>
         <w:t>Monitoreo Inteligente WES / Perfil hídrico horario — Bomba Principal</w:t>
@@ -2984,7 +2996,7 @@
       <w:r>
         <w:drawing>
           <wp:inline xmlns:a="http://schemas.openxmlformats.org/drawingml/2006/main" xmlns:pic="http://schemas.openxmlformats.org/drawingml/2006/picture">
-            <wp:extent cx="5440680" cy="1945697"/>
+            <wp:extent cx="5440680" cy="1927682"/>
             <wp:docPr id="13" name="Picture 13"/>
             <wp:cNvGraphicFramePr>
               <a:graphicFrameLocks noChangeAspect="1"/>
@@ -3005,7 +3017,7 @@
                   <pic:spPr>
                     <a:xfrm>
                       <a:off x="0" y="0"/>
-                      <a:ext cx="5440680" cy="1945697"/>
+                      <a:ext cx="5440680" cy="1927682"/>
                     </a:xfrm>
                     <a:prstGeom prst="rect"/>
                   </pic:spPr>
@@ -3038,7 +3050,7 @@
       <w:r>
         <w:drawing>
           <wp:inline xmlns:a="http://schemas.openxmlformats.org/drawingml/2006/main" xmlns:pic="http://schemas.openxmlformats.org/drawingml/2006/picture">
-            <wp:extent cx="5440680" cy="1945697"/>
+            <wp:extent cx="5440680" cy="1927682"/>
             <wp:docPr id="14" name="Picture 14"/>
             <wp:cNvGraphicFramePr>
               <a:graphicFrameLocks noChangeAspect="1"/>
@@ -3059,7 +3071,7 @@
                   <pic:spPr>
                     <a:xfrm>
                       <a:off x="0" y="0"/>
-                      <a:ext cx="5440680" cy="1945697"/>
+                      <a:ext cx="5440680" cy="1927682"/>
                     </a:xfrm>
                     <a:prstGeom prst="rect"/>
                   </pic:spPr>
@@ -3091,12 +3103,12 @@
     </w:p>
     <w:p>
       <w:pPr>
-        <w:spacing w:before="120" w:after="80"/>
+        <w:spacing w:before="160" w:after="80"/>
       </w:pPr>
       <w:r>
         <w:rPr>
           <w:b/>
-          <w:color w:val="003366"/>
+          <w:color w:val="374151"/>
           <w:sz w:val="22"/>
         </w:rPr>
         <w:t>Días cercanos al promedio — Bomba Principal</w:t>
@@ -3124,7 +3136,7 @@
       <w:r>
         <w:drawing>
           <wp:inline xmlns:a="http://schemas.openxmlformats.org/drawingml/2006/main" xmlns:pic="http://schemas.openxmlformats.org/drawingml/2006/picture">
-            <wp:extent cx="5303520" cy="1896646"/>
+            <wp:extent cx="5303520" cy="1879085"/>
             <wp:docPr id="15" name="Picture 15"/>
             <wp:cNvGraphicFramePr>
               <a:graphicFrameLocks noChangeAspect="1"/>
@@ -3145,7 +3157,7 @@
                   <pic:spPr>
                     <a:xfrm>
                       <a:off x="0" y="0"/>
-                      <a:ext cx="5303520" cy="1896646"/>
+                      <a:ext cx="5303520" cy="1879085"/>
                     </a:xfrm>
                     <a:prstGeom prst="rect"/>
                   </pic:spPr>
@@ -3178,7 +3190,7 @@
       <w:r>
         <w:drawing>
           <wp:inline xmlns:a="http://schemas.openxmlformats.org/drawingml/2006/main" xmlns:pic="http://schemas.openxmlformats.org/drawingml/2006/picture">
-            <wp:extent cx="5303520" cy="1896646"/>
+            <wp:extent cx="5303520" cy="1879085"/>
             <wp:docPr id="16" name="Picture 16"/>
             <wp:cNvGraphicFramePr>
               <a:graphicFrameLocks noChangeAspect="1"/>
@@ -3199,7 +3211,7 @@
                   <pic:spPr>
                     <a:xfrm>
                       <a:off x="0" y="0"/>
-                      <a:ext cx="5303520" cy="1896646"/>
+                      <a:ext cx="5303520" cy="1879085"/>
                     </a:xfrm>
                     <a:prstGeom prst="rect"/>
                   </pic:spPr>
@@ -3232,7 +3244,7 @@
       <w:r>
         <w:drawing>
           <wp:inline xmlns:a="http://schemas.openxmlformats.org/drawingml/2006/main" xmlns:pic="http://schemas.openxmlformats.org/drawingml/2006/picture">
-            <wp:extent cx="5303520" cy="1896646"/>
+            <wp:extent cx="5303520" cy="1879085"/>
             <wp:docPr id="17" name="Picture 17"/>
             <wp:cNvGraphicFramePr>
               <a:graphicFrameLocks noChangeAspect="1"/>
@@ -3253,7 +3265,7 @@
                   <pic:spPr>
                     <a:xfrm>
                       <a:off x="0" y="0"/>
-                      <a:ext cx="5303520" cy="1896646"/>
+                      <a:ext cx="5303520" cy="1879085"/>
                     </a:xfrm>
                     <a:prstGeom prst="rect"/>
                   </pic:spPr>
@@ -3285,12 +3297,12 @@
     </w:p>
     <w:p>
       <w:pPr>
-        <w:spacing w:before="120" w:after="80"/>
+        <w:spacing w:before="160" w:after="80"/>
       </w:pPr>
       <w:r>
         <w:rPr>
           <w:b/>
-          <w:color w:val="003366"/>
+          <w:color w:val="374151"/>
           <w:sz w:val="22"/>
         </w:rPr>
         <w:t>3) Sala de Bomba Sexto Piso</w:t>
@@ -3311,6 +3323,7 @@
         <w:tc>
           <w:tcPr>
             <w:tcW w:type="dxa" w:w="4968"/>
+            <w:shd w:fill="F7F9FC" w:val="clear"/>
           </w:tcPr>
           <w:p>
             <w:pPr>
@@ -3319,8 +3332,8 @@
             <w:r/>
             <w:r>
               <w:rPr>
-                <w:b/>
-                <w:color w:val="000000"/>
+                <w:b w:val="0"/>
+                <w:color w:val="374151"/>
                 <w:sz w:val="18"/>
               </w:rPr>
               <w:t>Total (m³)</w:t>
@@ -3330,6 +3343,7 @@
         <w:tc>
           <w:tcPr>
             <w:tcW w:type="dxa" w:w="4968"/>
+            <w:shd w:fill="F7F9FC" w:val="clear"/>
           </w:tcPr>
           <w:p>
             <w:pPr>
@@ -3339,7 +3353,7 @@
             <w:r>
               <w:rPr>
                 <w:b w:val="0"/>
-                <w:color w:val="000000"/>
+                <w:color w:val="111827"/>
                 <w:sz w:val="18"/>
               </w:rPr>
               <w:t>287,9</w:t>
@@ -3359,8 +3373,8 @@
             <w:r/>
             <w:r>
               <w:rPr>
-                <w:b/>
-                <w:color w:val="000000"/>
+                <w:b w:val="0"/>
+                <w:color w:val="374151"/>
                 <w:sz w:val="18"/>
               </w:rPr>
               <w:t>Promedio mensual (m³)</w:t>
@@ -3379,7 +3393,7 @@
             <w:r>
               <w:rPr>
                 <w:b w:val="0"/>
-                <w:color w:val="000000"/>
+                <w:color w:val="111827"/>
                 <w:sz w:val="18"/>
               </w:rPr>
               <w:t>139,3</w:t>
@@ -3391,6 +3405,7 @@
         <w:tc>
           <w:tcPr>
             <w:tcW w:type="dxa" w:w="4968"/>
+            <w:shd w:fill="F7F9FC" w:val="clear"/>
           </w:tcPr>
           <w:p>
             <w:pPr>
@@ -3399,8 +3414,8 @@
             <w:r/>
             <w:r>
               <w:rPr>
-                <w:b/>
-                <w:color w:val="000000"/>
+                <w:b w:val="0"/>
+                <w:color w:val="374151"/>
                 <w:sz w:val="18"/>
               </w:rPr>
               <w:t>Promedio diario (m³)</w:t>
@@ -3410,6 +3425,7 @@
         <w:tc>
           <w:tcPr>
             <w:tcW w:type="dxa" w:w="4968"/>
+            <w:shd w:fill="F7F9FC" w:val="clear"/>
           </w:tcPr>
           <w:p>
             <w:pPr>
@@ -3419,7 +3435,7 @@
             <w:r>
               <w:rPr>
                 <w:b w:val="0"/>
-                <w:color w:val="000000"/>
+                <w:color w:val="111827"/>
                 <w:sz w:val="18"/>
               </w:rPr>
               <w:t>5</w:t>
@@ -3439,8 +3455,8 @@
             <w:r/>
             <w:r>
               <w:rPr>
-                <w:b/>
-                <w:color w:val="000000"/>
+                <w:b w:val="0"/>
+                <w:color w:val="374151"/>
                 <w:sz w:val="18"/>
               </w:rPr>
               <w:t>Días con data</w:t>
@@ -3459,7 +3475,7 @@
             <w:r>
               <w:rPr>
                 <w:b w:val="0"/>
-                <w:color w:val="000000"/>
+                <w:color w:val="111827"/>
                 <w:sz w:val="18"/>
               </w:rPr>
               <w:t>58 / 62</w:t>
@@ -3471,6 +3487,7 @@
         <w:tc>
           <w:tcPr>
             <w:tcW w:type="dxa" w:w="4968"/>
+            <w:shd w:fill="F7F9FC" w:val="clear"/>
           </w:tcPr>
           <w:p>
             <w:pPr>
@@ -3479,8 +3496,8 @@
             <w:r/>
             <w:r>
               <w:rPr>
-                <w:b/>
-                <w:color w:val="000000"/>
+                <w:b w:val="0"/>
+                <w:color w:val="374151"/>
                 <w:sz w:val="18"/>
               </w:rPr>
               <w:t>Rango min y max diario (m³)</w:t>
@@ -3490,6 +3507,7 @@
         <w:tc>
           <w:tcPr>
             <w:tcW w:type="dxa" w:w="4968"/>
+            <w:shd w:fill="F7F9FC" w:val="clear"/>
           </w:tcPr>
           <w:p>
             <w:pPr>
@@ -3499,7 +3517,7 @@
             <w:r>
               <w:rPr>
                 <w:b w:val="0"/>
-                <w:color w:val="000000"/>
+                <w:color w:val="111827"/>
                 <w:sz w:val="18"/>
               </w:rPr>
               <w:t>1,4 – 12,1 m³ (18/08/2026 / 08/08/2026)</w:t>
@@ -3519,8 +3537,8 @@
             <w:r/>
             <w:r>
               <w:rPr>
-                <w:b/>
-                <w:color w:val="000000"/>
+                <w:b w:val="0"/>
+                <w:color w:val="374151"/>
                 <w:sz w:val="18"/>
               </w:rPr>
               <w:t>Hueco sin registro</w:t>
@@ -3539,7 +3557,7 @@
             <w:r>
               <w:rPr>
                 <w:b w:val="0"/>
-                <w:color w:val="000000"/>
+                <w:color w:val="111827"/>
                 <w:sz w:val="18"/>
               </w:rPr>
               <w:t>14/08/2026 – 17/08/2026 (lluvias)</w:t>
@@ -3551,6 +3569,7 @@
         <w:tc>
           <w:tcPr>
             <w:tcW w:type="dxa" w:w="4968"/>
+            <w:shd w:fill="F7F9FC" w:val="clear"/>
           </w:tcPr>
           <w:p>
             <w:pPr>
@@ -3559,8 +3578,8 @@
             <w:r/>
             <w:r>
               <w:rPr>
-                <w:b/>
-                <w:color w:val="000000"/>
+                <w:b w:val="0"/>
+                <w:color w:val="374151"/>
                 <w:sz w:val="18"/>
               </w:rPr>
               <w:t>% sobre Sanitaria</w:t>
@@ -3570,6 +3589,7 @@
         <w:tc>
           <w:tcPr>
             <w:tcW w:type="dxa" w:w="4968"/>
+            <w:shd w:fill="F7F9FC" w:val="clear"/>
           </w:tcPr>
           <w:p>
             <w:pPr>
@@ -3579,7 +3599,7 @@
             <w:r>
               <w:rPr>
                 <w:b w:val="0"/>
-                <w:color w:val="000000"/>
+                <w:color w:val="111827"/>
                 <w:sz w:val="18"/>
               </w:rPr>
               <w:t>6,2%</w:t>
@@ -3590,7 +3610,7 @@
     </w:tbl>
     <w:p>
       <w:pPr>
-        <w:spacing w:after="80"/>
+        <w:spacing w:after="120"/>
       </w:pPr>
     </w:p>
     <w:p>
@@ -3601,7 +3621,7 @@
       <w:r>
         <w:drawing>
           <wp:inline xmlns:a="http://schemas.openxmlformats.org/drawingml/2006/main" xmlns:pic="http://schemas.openxmlformats.org/drawingml/2006/picture">
-            <wp:extent cx="5440680" cy="1544600"/>
+            <wp:extent cx="5440680" cy="1523540"/>
             <wp:docPr id="18" name="Picture 18"/>
             <wp:cNvGraphicFramePr>
               <a:graphicFrameLocks noChangeAspect="1"/>
@@ -3622,7 +3642,7 @@
                   <pic:spPr>
                     <a:xfrm>
                       <a:off x="0" y="0"/>
-                      <a:ext cx="5440680" cy="1544600"/>
+                      <a:ext cx="5440680" cy="1523540"/>
                     </a:xfrm>
                     <a:prstGeom prst="rect"/>
                   </pic:spPr>
@@ -3671,7 +3691,7 @@
       <w:r>
         <w:drawing>
           <wp:inline xmlns:a="http://schemas.openxmlformats.org/drawingml/2006/main" xmlns:pic="http://schemas.openxmlformats.org/drawingml/2006/picture">
-            <wp:extent cx="5303520" cy="1435481"/>
+            <wp:extent cx="5303520" cy="1432881"/>
             <wp:docPr id="19" name="Picture 19"/>
             <wp:cNvGraphicFramePr>
               <a:graphicFrameLocks noChangeAspect="1"/>
@@ -3692,7 +3712,7 @@
                   <pic:spPr>
                     <a:xfrm>
                       <a:off x="0" y="0"/>
-                      <a:ext cx="5303520" cy="1435481"/>
+                      <a:ext cx="5303520" cy="1432881"/>
                     </a:xfrm>
                     <a:prstGeom prst="rect"/>
                   </pic:spPr>
@@ -3718,7 +3738,7 @@
         <w:tc>
           <w:tcPr>
             <w:tcW w:type="dxa" w:w="4968"/>
-            <w:shd w:fill="003366" w:val="clear"/>
+            <w:shd w:fill="D9E1F2" w:val="clear"/>
           </w:tcPr>
           <w:p>
             <w:pPr>
@@ -3727,7 +3747,7 @@
             <w:r>
               <w:rPr>
                 <w:b/>
-                <w:color w:val="FFFFFF"/>
+                <w:color w:val="1F3864"/>
                 <w:sz w:val="18"/>
               </w:rPr>
               <w:t>Día</w:t>
@@ -3737,7 +3757,7 @@
         <w:tc>
           <w:tcPr>
             <w:tcW w:type="dxa" w:w="4968"/>
-            <w:shd w:fill="003366" w:val="clear"/>
+            <w:shd w:fill="D9E1F2" w:val="clear"/>
           </w:tcPr>
           <w:p>
             <w:pPr>
@@ -3746,7 +3766,7 @@
             <w:r>
               <w:rPr>
                 <w:b/>
-                <w:color w:val="FFFFFF"/>
+                <w:color w:val="1F3864"/>
                 <w:sz w:val="18"/>
               </w:rPr>
               <w:t>Promedio (m³)</w:t>
@@ -4063,12 +4083,12 @@
     </w:p>
     <w:p>
       <w:pPr>
-        <w:spacing w:before="120" w:after="80"/>
+        <w:spacing w:before="160" w:after="80"/>
       </w:pPr>
       <w:r>
         <w:rPr>
           <w:b/>
-          <w:color w:val="003366"/>
+          <w:color w:val="374151"/>
           <w:sz w:val="22"/>
         </w:rPr>
         <w:t>Monitoreo Inteligente WES / Perfil hídrico horario — Sexto Piso</w:t>
@@ -4096,7 +4116,7 @@
       <w:r>
         <w:drawing>
           <wp:inline xmlns:a="http://schemas.openxmlformats.org/drawingml/2006/main" xmlns:pic="http://schemas.openxmlformats.org/drawingml/2006/picture">
-            <wp:extent cx="5440680" cy="1945697"/>
+            <wp:extent cx="5440680" cy="1927682"/>
             <wp:docPr id="20" name="Picture 20"/>
             <wp:cNvGraphicFramePr>
               <a:graphicFrameLocks noChangeAspect="1"/>
@@ -4117,7 +4137,7 @@
                   <pic:spPr>
                     <a:xfrm>
                       <a:off x="0" y="0"/>
-                      <a:ext cx="5440680" cy="1945697"/>
+                      <a:ext cx="5440680" cy="1927682"/>
                     </a:xfrm>
                     <a:prstGeom prst="rect"/>
                   </pic:spPr>
@@ -4150,7 +4170,7 @@
       <w:r>
         <w:drawing>
           <wp:inline xmlns:a="http://schemas.openxmlformats.org/drawingml/2006/main" xmlns:pic="http://schemas.openxmlformats.org/drawingml/2006/picture">
-            <wp:extent cx="5440680" cy="1945697"/>
+            <wp:extent cx="5440680" cy="1927682"/>
             <wp:docPr id="21" name="Picture 21"/>
             <wp:cNvGraphicFramePr>
               <a:graphicFrameLocks noChangeAspect="1"/>
@@ -4171,7 +4191,7 @@
                   <pic:spPr>
                     <a:xfrm>
                       <a:off x="0" y="0"/>
-                      <a:ext cx="5440680" cy="1945697"/>
+                      <a:ext cx="5440680" cy="1927682"/>
                     </a:xfrm>
                     <a:prstGeom prst="rect"/>
                   </pic:spPr>
@@ -4203,12 +4223,12 @@
     </w:p>
     <w:p>
       <w:pPr>
-        <w:spacing w:before="120" w:after="80"/>
+        <w:spacing w:before="160" w:after="80"/>
       </w:pPr>
       <w:r>
         <w:rPr>
           <w:b/>
-          <w:color w:val="003366"/>
+          <w:color w:val="374151"/>
           <w:sz w:val="22"/>
         </w:rPr>
         <w:t>Días cercanos al promedio — Sexto Piso</w:t>
@@ -4236,7 +4256,7 @@
       <w:r>
         <w:drawing>
           <wp:inline xmlns:a="http://schemas.openxmlformats.org/drawingml/2006/main" xmlns:pic="http://schemas.openxmlformats.org/drawingml/2006/picture">
-            <wp:extent cx="5303520" cy="1896646"/>
+            <wp:extent cx="5303520" cy="1879085"/>
             <wp:docPr id="22" name="Picture 22"/>
             <wp:cNvGraphicFramePr>
               <a:graphicFrameLocks noChangeAspect="1"/>
@@ -4257,7 +4277,7 @@
                   <pic:spPr>
                     <a:xfrm>
                       <a:off x="0" y="0"/>
-                      <a:ext cx="5303520" cy="1896646"/>
+                      <a:ext cx="5303520" cy="1879085"/>
                     </a:xfrm>
                     <a:prstGeom prst="rect"/>
                   </pic:spPr>
@@ -4290,7 +4310,7 @@
       <w:r>
         <w:drawing>
           <wp:inline xmlns:a="http://schemas.openxmlformats.org/drawingml/2006/main" xmlns:pic="http://schemas.openxmlformats.org/drawingml/2006/picture">
-            <wp:extent cx="5303520" cy="1896646"/>
+            <wp:extent cx="5303520" cy="1879085"/>
             <wp:docPr id="23" name="Picture 23"/>
             <wp:cNvGraphicFramePr>
               <a:graphicFrameLocks noChangeAspect="1"/>
@@ -4311,7 +4331,7 @@
                   <pic:spPr>
                     <a:xfrm>
                       <a:off x="0" y="0"/>
-                      <a:ext cx="5303520" cy="1896646"/>
+                      <a:ext cx="5303520" cy="1879085"/>
                     </a:xfrm>
                     <a:prstGeom prst="rect"/>
                   </pic:spPr>
@@ -4344,7 +4364,7 @@
       <w:r>
         <w:drawing>
           <wp:inline xmlns:a="http://schemas.openxmlformats.org/drawingml/2006/main" xmlns:pic="http://schemas.openxmlformats.org/drawingml/2006/picture">
-            <wp:extent cx="5303520" cy="1896646"/>
+            <wp:extent cx="5303520" cy="1879085"/>
             <wp:docPr id="24" name="Picture 24"/>
             <wp:cNvGraphicFramePr>
               <a:graphicFrameLocks noChangeAspect="1"/>
@@ -4365,7 +4385,7 @@
                   <pic:spPr>
                     <a:xfrm>
                       <a:off x="0" y="0"/>
-                      <a:ext cx="5303520" cy="1896646"/>
+                      <a:ext cx="5303520" cy="1879085"/>
                     </a:xfrm>
                     <a:prstGeom prst="rect"/>
                   </pic:spPr>
@@ -4397,12 +4417,12 @@
     </w:p>
     <w:p>
       <w:pPr>
-        <w:spacing w:before="120" w:after="80"/>
+        <w:spacing w:before="160" w:after="80"/>
       </w:pPr>
       <w:r>
         <w:rPr>
           <w:b/>
-          <w:color w:val="003366"/>
+          <w:color w:val="374151"/>
           <w:sz w:val="22"/>
         </w:rPr>
         <w:t>Participación sobre Sanitaria (periodo)</w:t>
@@ -4424,7 +4444,7 @@
         <w:tc>
           <w:tcPr>
             <w:tcW w:type="dxa" w:w="3312"/>
-            <w:shd w:fill="003366" w:val="clear"/>
+            <w:shd w:fill="D9E1F2" w:val="clear"/>
           </w:tcPr>
           <w:p>
             <w:pPr>
@@ -4433,7 +4453,7 @@
             <w:r>
               <w:rPr>
                 <w:b/>
-                <w:color w:val="FFFFFF"/>
+                <w:color w:val="1F3864"/>
                 <w:sz w:val="18"/>
               </w:rPr>
               <w:t>Punto</w:t>
@@ -4443,7 +4463,7 @@
         <w:tc>
           <w:tcPr>
             <w:tcW w:type="dxa" w:w="3312"/>
-            <w:shd w:fill="003366" w:val="clear"/>
+            <w:shd w:fill="D9E1F2" w:val="clear"/>
           </w:tcPr>
           <w:p>
             <w:pPr>
@@ -4452,7 +4472,7 @@
             <w:r>
               <w:rPr>
                 <w:b/>
-                <w:color w:val="FFFFFF"/>
+                <w:color w:val="1F3864"/>
                 <w:sz w:val="18"/>
               </w:rPr>
               <w:t>Consumo (m³)</w:t>
@@ -4462,7 +4482,7 @@
         <w:tc>
           <w:tcPr>
             <w:tcW w:type="dxa" w:w="3312"/>
-            <w:shd w:fill="003366" w:val="clear"/>
+            <w:shd w:fill="D9E1F2" w:val="clear"/>
           </w:tcPr>
           <w:p>
             <w:pPr>
@@ -4471,7 +4491,7 @@
             <w:r>
               <w:rPr>
                 <w:b/>
-                <w:color w:val="FFFFFF"/>
+                <w:color w:val="1F3864"/>
                 <w:sz w:val="18"/>
               </w:rPr>
               <w:t>%</w:t>
@@ -4827,13 +4847,13 @@
     </w:p>
     <w:p>
       <w:pPr>
-        <w:spacing w:before="160" w:after="120"/>
+        <w:spacing w:before="200" w:after="120"/>
       </w:pPr>
       <w:r>
         <w:rPr>
           <w:b/>
-          <w:color w:val="003366"/>
-          <w:sz w:val="28"/>
+          <w:color w:val="2F5496"/>
+          <w:sz w:val="26"/>
         </w:rPr>
         <w:t>VI. Facturación sanitaria — Aguas Antofagasta</w:t>
       </w:r>
@@ -4910,7 +4930,7 @@
         <w:tc>
           <w:tcPr>
             <w:tcW w:type="dxa" w:w="1987"/>
-            <w:shd w:fill="003366" w:val="clear"/>
+            <w:shd w:fill="D9E1F2" w:val="clear"/>
           </w:tcPr>
           <w:p>
             <w:pPr>
@@ -4919,7 +4939,7 @@
             <w:r>
               <w:rPr>
                 <w:b/>
-                <w:color w:val="FFFFFF"/>
+                <w:color w:val="1F3864"/>
                 <w:sz w:val="18"/>
               </w:rPr>
               <w:t>Periodo</w:t>
@@ -4929,7 +4949,7 @@
         <w:tc>
           <w:tcPr>
             <w:tcW w:type="dxa" w:w="1987"/>
-            <w:shd w:fill="003366" w:val="clear"/>
+            <w:shd w:fill="D9E1F2" w:val="clear"/>
           </w:tcPr>
           <w:p>
             <w:pPr>
@@ -4938,7 +4958,7 @@
             <w:r>
               <w:rPr>
                 <w:b/>
-                <w:color w:val="FFFFFF"/>
+                <w:color w:val="1F3864"/>
                 <w:sz w:val="18"/>
               </w:rPr>
               <w:t>Emisión</w:t>
@@ -4948,7 +4968,7 @@
         <w:tc>
           <w:tcPr>
             <w:tcW w:type="dxa" w:w="1987"/>
-            <w:shd w:fill="003366" w:val="clear"/>
+            <w:shd w:fill="D9E1F2" w:val="clear"/>
           </w:tcPr>
           <w:p>
             <w:pPr>
@@ -4957,7 +4977,7 @@
             <w:r>
               <w:rPr>
                 <w:b/>
-                <w:color w:val="FFFFFF"/>
+                <w:color w:val="1F3864"/>
                 <w:sz w:val="18"/>
               </w:rPr>
               <w:t>Consumo (m³)</w:t>
@@ -4967,7 +4987,7 @@
         <w:tc>
           <w:tcPr>
             <w:tcW w:type="dxa" w:w="1987"/>
-            <w:shd w:fill="003366" w:val="clear"/>
+            <w:shd w:fill="D9E1F2" w:val="clear"/>
           </w:tcPr>
           <w:p>
             <w:pPr>
@@ -4976,7 +4996,7 @@
             <w:r>
               <w:rPr>
                 <w:b/>
-                <w:color w:val="FFFFFF"/>
+                <w:color w:val="1F3864"/>
                 <w:sz w:val="18"/>
               </w:rPr>
               <w:t>Monto facturado</w:t>
@@ -4986,7 +5006,7 @@
         <w:tc>
           <w:tcPr>
             <w:tcW w:type="dxa" w:w="1987"/>
-            <w:shd w:fill="003366" w:val="clear"/>
+            <w:shd w:fill="D9E1F2" w:val="clear"/>
           </w:tcPr>
           <w:p>
             <w:pPr>
@@ -4995,7 +5015,7 @@
             <w:r>
               <w:rPr>
                 <w:b/>
-                <w:color w:val="FFFFFF"/>
+                <w:color w:val="1F3864"/>
                 <w:sz w:val="18"/>
               </w:rPr>
               <w:t>N° factura</w:t>
@@ -5496,12 +5516,12 @@
     </w:p>
     <w:p>
       <w:pPr>
-        <w:spacing w:before="120" w:after="80"/>
+        <w:spacing w:before="160" w:after="80"/>
       </w:pPr>
       <w:r>
         <w:rPr>
           <w:b/>
-          <w:color w:val="003366"/>
+          <w:color w:val="374151"/>
           <w:sz w:val="22"/>
         </w:rPr>
         <w:t>Lecturas encadenadas — medidor 534</w:t>
@@ -5525,7 +5545,7 @@
         <w:tc>
           <w:tcPr>
             <w:tcW w:type="dxa" w:w="1987"/>
-            <w:shd w:fill="003366" w:val="clear"/>
+            <w:shd w:fill="D9E1F2" w:val="clear"/>
           </w:tcPr>
           <w:p>
             <w:pPr>
@@ -5534,7 +5554,7 @@
             <w:r>
               <w:rPr>
                 <w:b/>
-                <w:color w:val="FFFFFF"/>
+                <w:color w:val="1F3864"/>
                 <w:sz w:val="18"/>
               </w:rPr>
               <w:t>Ciclo</w:t>
@@ -5544,7 +5564,7 @@
         <w:tc>
           <w:tcPr>
             <w:tcW w:type="dxa" w:w="1987"/>
-            <w:shd w:fill="003366" w:val="clear"/>
+            <w:shd w:fill="D9E1F2" w:val="clear"/>
           </w:tcPr>
           <w:p>
             <w:pPr>
@@ -5553,7 +5573,7 @@
             <w:r>
               <w:rPr>
                 <w:b/>
-                <w:color w:val="FFFFFF"/>
+                <w:color w:val="1F3864"/>
                 <w:sz w:val="18"/>
               </w:rPr>
               <w:t>Lect. anterior</w:t>
@@ -5563,7 +5583,7 @@
         <w:tc>
           <w:tcPr>
             <w:tcW w:type="dxa" w:w="1987"/>
-            <w:shd w:fill="003366" w:val="clear"/>
+            <w:shd w:fill="D9E1F2" w:val="clear"/>
           </w:tcPr>
           <w:p>
             <w:pPr>
@@ -5572,7 +5592,7 @@
             <w:r>
               <w:rPr>
                 <w:b/>
-                <w:color w:val="FFFFFF"/>
+                <w:color w:val="1F3864"/>
                 <w:sz w:val="18"/>
               </w:rPr>
               <w:t>Lect. actual</w:t>
@@ -5582,7 +5602,7 @@
         <w:tc>
           <w:tcPr>
             <w:tcW w:type="dxa" w:w="1987"/>
-            <w:shd w:fill="003366" w:val="clear"/>
+            <w:shd w:fill="D9E1F2" w:val="clear"/>
           </w:tcPr>
           <w:p>
             <w:pPr>
@@ -5591,7 +5611,7 @@
             <w:r>
               <w:rPr>
                 <w:b/>
-                <w:color w:val="FFFFFF"/>
+                <w:color w:val="1F3864"/>
                 <w:sz w:val="18"/>
               </w:rPr>
               <w:t>m³</w:t>
@@ -5601,7 +5621,7 @@
         <w:tc>
           <w:tcPr>
             <w:tcW w:type="dxa" w:w="1987"/>
-            <w:shd w:fill="003366" w:val="clear"/>
+            <w:shd w:fill="D9E1F2" w:val="clear"/>
           </w:tcPr>
           <w:p>
             <w:pPr>
@@ -5610,7 +5630,7 @@
             <w:r>
               <w:rPr>
                 <w:b/>
-                <w:color w:val="FFFFFF"/>
+                <w:color w:val="1F3864"/>
                 <w:sz w:val="18"/>
               </w:rPr>
               <w:t>N° factura</w:t>
@@ -6019,13 +6039,13 @@
     </w:p>
     <w:p>
       <w:pPr>
-        <w:spacing w:before="160" w:after="120"/>
+        <w:spacing w:before="200" w:after="120"/>
       </w:pPr>
       <w:r>
         <w:rPr>
           <w:b/>
-          <w:color w:val="003366"/>
-          <w:sz w:val="28"/>
+          <w:color w:val="2F5496"/>
+          <w:sz w:val="26"/>
         </w:rPr>
         <w:t>VII. Conclusiones y hallazgos</w:t>
       </w:r>
@@ -6107,13 +6127,13 @@
     </w:p>
     <w:p>
       <w:pPr>
-        <w:spacing w:before="160" w:after="120"/>
+        <w:spacing w:before="200" w:after="120"/>
       </w:pPr>
       <w:r>
         <w:rPr>
           <w:b/>
-          <w:color w:val="003366"/>
-          <w:sz w:val="28"/>
+          <w:color w:val="2F5496"/>
+          <w:sz w:val="26"/>
         </w:rPr>
         <w:t>VIII. Recomendaciones y próximos pasos</w:t>
       </w:r>
@@ -6189,7 +6209,7 @@
           <w:color w:val="000000"/>
           <w:sz w:val="16"/>
         </w:rPr>
-        <w:t>Documento generado 20/10/2026 19:38 · WES · Clínica Bupa Antofagasta</w:t>
+        <w:t>Documento generado 20/10/2026 19:56 · WES · Clínica Bupa Antofagasta</w:t>
       </w:r>
     </w:p>
     <w:sectPr>

</xml_diff>